<commit_message>
feat(orders): edit/delete orders, rename 結單→出貨, export per-city xlsx tabs
</commit_message>
<xml_diff>
--- a/public/標籤.docx
+++ b/public/標籤.docx
@@ -130,6 +130,14 @@
               <w:fldChar w:fldCharType="end"/>
             </w:r>
             <w:r>
+              <w:rPr>
+                <w:rFonts w:hint="eastAsia"/>
+                <w:b/>
+                <w:bCs/>
+              </w:rPr>
+              <w:t xml:space="preserve"> </w:t>
+            </w:r>
+            <w:r>
               <w:fldChar w:fldCharType="begin"/>
             </w:r>
             <w:r>
@@ -497,6 +505,14 @@
               <w:fldChar w:fldCharType="end"/>
             </w:r>
             <w:r>
+              <w:rPr>
+                <w:rFonts w:hint="eastAsia"/>
+                <w:b/>
+                <w:bCs/>
+              </w:rPr>
+              <w:t xml:space="preserve"> </w:t>
+            </w:r>
+            <w:r>
               <w:fldChar w:fldCharType="begin"/>
             </w:r>
             <w:r>
@@ -862,6 +878,14 @@
                 <w:bCs/>
               </w:rPr>
               <w:fldChar w:fldCharType="end"/>
+            </w:r>
+            <w:r>
+              <w:rPr>
+                <w:rFonts w:hint="eastAsia"/>
+                <w:b/>
+                <w:bCs/>
+              </w:rPr>
+              <w:t xml:space="preserve"> </w:t>
             </w:r>
             <w:r>
               <w:fldChar w:fldCharType="begin"/>
@@ -1237,6 +1261,14 @@
               <w:fldChar w:fldCharType="end"/>
             </w:r>
             <w:r>
+              <w:rPr>
+                <w:rFonts w:hint="eastAsia"/>
+                <w:b/>
+                <w:bCs/>
+              </w:rPr>
+              <w:t xml:space="preserve"> </w:t>
+            </w:r>
+            <w:r>
               <w:fldChar w:fldCharType="begin"/>
             </w:r>
             <w:r>
@@ -1604,6 +1636,14 @@
               <w:fldChar w:fldCharType="end"/>
             </w:r>
             <w:r>
+              <w:rPr>
+                <w:rFonts w:hint="eastAsia"/>
+                <w:b/>
+                <w:bCs/>
+              </w:rPr>
+              <w:t xml:space="preserve"> </w:t>
+            </w:r>
+            <w:r>
               <w:fldChar w:fldCharType="begin"/>
             </w:r>
             <w:r>
@@ -1969,6 +2009,14 @@
                 <w:bCs/>
               </w:rPr>
               <w:fldChar w:fldCharType="end"/>
+            </w:r>
+            <w:r>
+              <w:rPr>
+                <w:rFonts w:hint="eastAsia"/>
+                <w:b/>
+                <w:bCs/>
+              </w:rPr>
+              <w:t xml:space="preserve"> </w:t>
             </w:r>
             <w:r>
               <w:fldChar w:fldCharType="begin"/>
@@ -2344,6 +2392,14 @@
               <w:fldChar w:fldCharType="end"/>
             </w:r>
             <w:r>
+              <w:rPr>
+                <w:rFonts w:hint="eastAsia"/>
+                <w:b/>
+                <w:bCs/>
+              </w:rPr>
+              <w:t xml:space="preserve"> </w:t>
+            </w:r>
+            <w:r>
               <w:fldChar w:fldCharType="begin"/>
             </w:r>
             <w:r>
@@ -2711,6 +2767,14 @@
               <w:fldChar w:fldCharType="end"/>
             </w:r>
             <w:r>
+              <w:rPr>
+                <w:rFonts w:hint="eastAsia"/>
+                <w:b/>
+                <w:bCs/>
+              </w:rPr>
+              <w:t xml:space="preserve"> </w:t>
+            </w:r>
+            <w:r>
               <w:fldChar w:fldCharType="begin"/>
             </w:r>
             <w:r>
@@ -3076,6 +3140,14 @@
                 <w:bCs/>
               </w:rPr>
               <w:fldChar w:fldCharType="end"/>
+            </w:r>
+            <w:r>
+              <w:rPr>
+                <w:rFonts w:hint="eastAsia"/>
+                <w:b/>
+                <w:bCs/>
+              </w:rPr>
+              <w:t xml:space="preserve"> </w:t>
             </w:r>
             <w:r>
               <w:fldChar w:fldCharType="begin"/>
@@ -3451,6 +3523,14 @@
               <w:fldChar w:fldCharType="end"/>
             </w:r>
             <w:r>
+              <w:rPr>
+                <w:rFonts w:hint="eastAsia"/>
+                <w:b/>
+                <w:bCs/>
+              </w:rPr>
+              <w:t xml:space="preserve"> </w:t>
+            </w:r>
+            <w:r>
               <w:fldChar w:fldCharType="begin"/>
             </w:r>
             <w:r>
@@ -3818,6 +3898,14 @@
               <w:fldChar w:fldCharType="end"/>
             </w:r>
             <w:r>
+              <w:rPr>
+                <w:rFonts w:hint="eastAsia"/>
+                <w:b/>
+                <w:bCs/>
+              </w:rPr>
+              <w:t xml:space="preserve"> </w:t>
+            </w:r>
+            <w:r>
               <w:fldChar w:fldCharType="begin"/>
             </w:r>
             <w:r>
@@ -4183,6 +4271,14 @@
                 <w:bCs/>
               </w:rPr>
               <w:fldChar w:fldCharType="end"/>
+            </w:r>
+            <w:r>
+              <w:rPr>
+                <w:rFonts w:hint="eastAsia"/>
+                <w:b/>
+                <w:bCs/>
+              </w:rPr>
+              <w:t xml:space="preserve"> </w:t>
             </w:r>
             <w:r>
               <w:fldChar w:fldCharType="begin"/>
@@ -4558,6 +4654,14 @@
               <w:fldChar w:fldCharType="end"/>
             </w:r>
             <w:r>
+              <w:rPr>
+                <w:rFonts w:hint="eastAsia"/>
+                <w:b/>
+                <w:bCs/>
+              </w:rPr>
+              <w:t xml:space="preserve"> </w:t>
+            </w:r>
+            <w:r>
               <w:fldChar w:fldCharType="begin"/>
             </w:r>
             <w:r>
@@ -4925,6 +5029,14 @@
               <w:fldChar w:fldCharType="end"/>
             </w:r>
             <w:r>
+              <w:rPr>
+                <w:rFonts w:hint="eastAsia"/>
+                <w:b/>
+                <w:bCs/>
+              </w:rPr>
+              <w:t xml:space="preserve"> </w:t>
+            </w:r>
+            <w:r>
               <w:fldChar w:fldCharType="begin"/>
             </w:r>
             <w:r>
@@ -5290,6 +5402,14 @@
                 <w:bCs/>
               </w:rPr>
               <w:fldChar w:fldCharType="end"/>
+            </w:r>
+            <w:r>
+              <w:rPr>
+                <w:rFonts w:hint="eastAsia"/>
+                <w:b/>
+                <w:bCs/>
+              </w:rPr>
+              <w:t xml:space="preserve"> </w:t>
             </w:r>
             <w:r>
               <w:fldChar w:fldCharType="begin"/>
@@ -5665,6 +5785,14 @@
               <w:fldChar w:fldCharType="end"/>
             </w:r>
             <w:r>
+              <w:rPr>
+                <w:rFonts w:hint="eastAsia"/>
+                <w:b/>
+                <w:bCs/>
+              </w:rPr>
+              <w:t xml:space="preserve"> </w:t>
+            </w:r>
+            <w:r>
               <w:fldChar w:fldCharType="begin"/>
             </w:r>
             <w:r>
@@ -6032,6 +6160,14 @@
               <w:fldChar w:fldCharType="end"/>
             </w:r>
             <w:r>
+              <w:rPr>
+                <w:rFonts w:hint="eastAsia"/>
+                <w:b/>
+                <w:bCs/>
+              </w:rPr>
+              <w:t xml:space="preserve"> </w:t>
+            </w:r>
+            <w:r>
               <w:fldChar w:fldCharType="begin"/>
             </w:r>
             <w:r>
@@ -6397,6 +6533,14 @@
                 <w:bCs/>
               </w:rPr>
               <w:fldChar w:fldCharType="end"/>
+            </w:r>
+            <w:r>
+              <w:rPr>
+                <w:rFonts w:hint="eastAsia"/>
+                <w:b/>
+                <w:bCs/>
+              </w:rPr>
+              <w:t xml:space="preserve"> </w:t>
             </w:r>
             <w:r>
               <w:fldChar w:fldCharType="begin"/>
@@ -6772,6 +6916,14 @@
               <w:fldChar w:fldCharType="end"/>
             </w:r>
             <w:r>
+              <w:rPr>
+                <w:rFonts w:hint="eastAsia"/>
+                <w:b/>
+                <w:bCs/>
+              </w:rPr>
+              <w:t xml:space="preserve"> </w:t>
+            </w:r>
+            <w:r>
               <w:fldChar w:fldCharType="begin"/>
             </w:r>
             <w:r>
@@ -7139,6 +7291,14 @@
               <w:fldChar w:fldCharType="end"/>
             </w:r>
             <w:r>
+              <w:rPr>
+                <w:rFonts w:hint="eastAsia"/>
+                <w:b/>
+                <w:bCs/>
+              </w:rPr>
+              <w:t xml:space="preserve"> </w:t>
+            </w:r>
+            <w:r>
               <w:fldChar w:fldCharType="begin"/>
             </w:r>
             <w:r>
@@ -7504,6 +7664,14 @@
                 <w:bCs/>
               </w:rPr>
               <w:fldChar w:fldCharType="end"/>
+            </w:r>
+            <w:r>
+              <w:rPr>
+                <w:rFonts w:hint="eastAsia"/>
+                <w:b/>
+                <w:bCs/>
+              </w:rPr>
+              <w:t xml:space="preserve"> </w:t>
             </w:r>
             <w:r>
               <w:fldChar w:fldCharType="begin"/>

</xml_diff>

<commit_message>
feat: sort orders by tag and add source column to export
</commit_message>
<xml_diff>
--- a/public/標籤.docx
+++ b/public/標籤.docx
@@ -49,6 +49,7 @@
               <w:ind w:left="190" w:right="190"/>
               <w:jc w:val="center"/>
               <w:rPr>
+                <w:rFonts w:hint="eastAsia"/>
                 <w:b/>
                 <w:bCs/>
               </w:rPr>
@@ -173,6 +174,55 @@
             </w:r>
             <w:r>
               <w:fldChar w:fldCharType="end"/>
+            </w:r>
+            <w:r>
+              <w:rPr>
+                <w:rFonts w:hint="eastAsia"/>
+              </w:rPr>
+              <w:t>(</w:t>
+            </w:r>
+            <w:r>
+              <w:fldChar w:fldCharType="begin"/>
+            </w:r>
+            <w:r>
+              <w:instrText xml:space="preserve"> MERGEFIELD </w:instrText>
+            </w:r>
+            <w:r>
+              <w:instrText>來源</w:instrText>
+            </w:r>
+            <w:r>
+              <w:instrText xml:space="preserve"> </w:instrText>
+            </w:r>
+            <w:r>
+              <w:fldChar w:fldCharType="separate"/>
+            </w:r>
+            <w:r>
+              <w:rPr>
+                <w:noProof/>
+              </w:rPr>
+              <w:t>«</w:t>
+            </w:r>
+            <w:r>
+              <w:rPr>
+                <w:rFonts w:hint="eastAsia"/>
+                <w:noProof/>
+              </w:rPr>
+              <w:t>來源</w:t>
+            </w:r>
+            <w:r>
+              <w:rPr>
+                <w:noProof/>
+              </w:rPr>
+              <w:t>»</w:t>
+            </w:r>
+            <w:r>
+              <w:fldChar w:fldCharType="end"/>
+            </w:r>
+            <w:r>
+              <w:rPr>
+                <w:rFonts w:hint="eastAsia"/>
+              </w:rPr>
+              <w:t>)</w:t>
             </w:r>
           </w:p>
           <w:p>
@@ -424,6 +474,7 @@
               <w:ind w:left="190" w:right="190"/>
               <w:jc w:val="center"/>
               <w:rPr>
+                <w:rFonts w:hint="eastAsia"/>
                 <w:b/>
                 <w:bCs/>
               </w:rPr>
@@ -548,6 +599,55 @@
             </w:r>
             <w:r>
               <w:fldChar w:fldCharType="end"/>
+            </w:r>
+            <w:r>
+              <w:rPr>
+                <w:rFonts w:hint="eastAsia"/>
+              </w:rPr>
+              <w:t>(</w:t>
+            </w:r>
+            <w:r>
+              <w:fldChar w:fldCharType="begin"/>
+            </w:r>
+            <w:r>
+              <w:instrText xml:space="preserve"> MERGEFIELD </w:instrText>
+            </w:r>
+            <w:r>
+              <w:instrText>來源</w:instrText>
+            </w:r>
+            <w:r>
+              <w:instrText xml:space="preserve"> </w:instrText>
+            </w:r>
+            <w:r>
+              <w:fldChar w:fldCharType="separate"/>
+            </w:r>
+            <w:r>
+              <w:rPr>
+                <w:noProof/>
+              </w:rPr>
+              <w:t>«</w:t>
+            </w:r>
+            <w:r>
+              <w:rPr>
+                <w:rFonts w:hint="eastAsia"/>
+                <w:noProof/>
+              </w:rPr>
+              <w:t>來源</w:t>
+            </w:r>
+            <w:r>
+              <w:rPr>
+                <w:noProof/>
+              </w:rPr>
+              <w:t>»</w:t>
+            </w:r>
+            <w:r>
+              <w:fldChar w:fldCharType="end"/>
+            </w:r>
+            <w:r>
+              <w:rPr>
+                <w:rFonts w:hint="eastAsia"/>
+              </w:rPr>
+              <w:t>)</w:t>
             </w:r>
           </w:p>
           <w:p>
@@ -799,6 +899,7 @@
               <w:ind w:left="190" w:right="190"/>
               <w:jc w:val="center"/>
               <w:rPr>
+                <w:rFonts w:hint="eastAsia"/>
                 <w:b/>
                 <w:bCs/>
               </w:rPr>
@@ -923,6 +1024,55 @@
             </w:r>
             <w:r>
               <w:fldChar w:fldCharType="end"/>
+            </w:r>
+            <w:r>
+              <w:rPr>
+                <w:rFonts w:hint="eastAsia"/>
+              </w:rPr>
+              <w:t>(</w:t>
+            </w:r>
+            <w:r>
+              <w:fldChar w:fldCharType="begin"/>
+            </w:r>
+            <w:r>
+              <w:instrText xml:space="preserve"> MERGEFIELD </w:instrText>
+            </w:r>
+            <w:r>
+              <w:instrText>來源</w:instrText>
+            </w:r>
+            <w:r>
+              <w:instrText xml:space="preserve"> </w:instrText>
+            </w:r>
+            <w:r>
+              <w:fldChar w:fldCharType="separate"/>
+            </w:r>
+            <w:r>
+              <w:rPr>
+                <w:noProof/>
+              </w:rPr>
+              <w:t>«</w:t>
+            </w:r>
+            <w:r>
+              <w:rPr>
+                <w:rFonts w:hint="eastAsia"/>
+                <w:noProof/>
+              </w:rPr>
+              <w:t>來源</w:t>
+            </w:r>
+            <w:r>
+              <w:rPr>
+                <w:noProof/>
+              </w:rPr>
+              <w:t>»</w:t>
+            </w:r>
+            <w:r>
+              <w:fldChar w:fldCharType="end"/>
+            </w:r>
+            <w:r>
+              <w:rPr>
+                <w:rFonts w:hint="eastAsia"/>
+              </w:rPr>
+              <w:t>)</w:t>
             </w:r>
           </w:p>
           <w:p>
@@ -1180,6 +1330,7 @@
               <w:ind w:left="190" w:right="190"/>
               <w:jc w:val="center"/>
               <w:rPr>
+                <w:rFonts w:hint="eastAsia"/>
                 <w:b/>
                 <w:bCs/>
               </w:rPr>
@@ -1304,6 +1455,55 @@
             </w:r>
             <w:r>
               <w:fldChar w:fldCharType="end"/>
+            </w:r>
+            <w:r>
+              <w:rPr>
+                <w:rFonts w:hint="eastAsia"/>
+              </w:rPr>
+              <w:t>(</w:t>
+            </w:r>
+            <w:r>
+              <w:fldChar w:fldCharType="begin"/>
+            </w:r>
+            <w:r>
+              <w:instrText xml:space="preserve"> MERGEFIELD </w:instrText>
+            </w:r>
+            <w:r>
+              <w:instrText>來源</w:instrText>
+            </w:r>
+            <w:r>
+              <w:instrText xml:space="preserve"> </w:instrText>
+            </w:r>
+            <w:r>
+              <w:fldChar w:fldCharType="separate"/>
+            </w:r>
+            <w:r>
+              <w:rPr>
+                <w:noProof/>
+              </w:rPr>
+              <w:t>«</w:t>
+            </w:r>
+            <w:r>
+              <w:rPr>
+                <w:rFonts w:hint="eastAsia"/>
+                <w:noProof/>
+              </w:rPr>
+              <w:t>來源</w:t>
+            </w:r>
+            <w:r>
+              <w:rPr>
+                <w:noProof/>
+              </w:rPr>
+              <w:t>»</w:t>
+            </w:r>
+            <w:r>
+              <w:fldChar w:fldCharType="end"/>
+            </w:r>
+            <w:r>
+              <w:rPr>
+                <w:rFonts w:hint="eastAsia"/>
+              </w:rPr>
+              <w:t>)</w:t>
             </w:r>
           </w:p>
           <w:p>
@@ -1555,6 +1755,7 @@
               <w:ind w:left="190" w:right="190"/>
               <w:jc w:val="center"/>
               <w:rPr>
+                <w:rFonts w:hint="eastAsia"/>
                 <w:b/>
                 <w:bCs/>
               </w:rPr>
@@ -1679,6 +1880,55 @@
             </w:r>
             <w:r>
               <w:fldChar w:fldCharType="end"/>
+            </w:r>
+            <w:r>
+              <w:rPr>
+                <w:rFonts w:hint="eastAsia"/>
+              </w:rPr>
+              <w:t>(</w:t>
+            </w:r>
+            <w:r>
+              <w:fldChar w:fldCharType="begin"/>
+            </w:r>
+            <w:r>
+              <w:instrText xml:space="preserve"> MERGEFIELD </w:instrText>
+            </w:r>
+            <w:r>
+              <w:instrText>來源</w:instrText>
+            </w:r>
+            <w:r>
+              <w:instrText xml:space="preserve"> </w:instrText>
+            </w:r>
+            <w:r>
+              <w:fldChar w:fldCharType="separate"/>
+            </w:r>
+            <w:r>
+              <w:rPr>
+                <w:noProof/>
+              </w:rPr>
+              <w:t>«</w:t>
+            </w:r>
+            <w:r>
+              <w:rPr>
+                <w:rFonts w:hint="eastAsia"/>
+                <w:noProof/>
+              </w:rPr>
+              <w:t>來源</w:t>
+            </w:r>
+            <w:r>
+              <w:rPr>
+                <w:noProof/>
+              </w:rPr>
+              <w:t>»</w:t>
+            </w:r>
+            <w:r>
+              <w:fldChar w:fldCharType="end"/>
+            </w:r>
+            <w:r>
+              <w:rPr>
+                <w:rFonts w:hint="eastAsia"/>
+              </w:rPr>
+              <w:t>)</w:t>
             </w:r>
           </w:p>
           <w:p>
@@ -1930,6 +2180,7 @@
               <w:ind w:left="190" w:right="190"/>
               <w:jc w:val="center"/>
               <w:rPr>
+                <w:rFonts w:hint="eastAsia"/>
                 <w:b/>
                 <w:bCs/>
               </w:rPr>
@@ -2054,6 +2305,55 @@
             </w:r>
             <w:r>
               <w:fldChar w:fldCharType="end"/>
+            </w:r>
+            <w:r>
+              <w:rPr>
+                <w:rFonts w:hint="eastAsia"/>
+              </w:rPr>
+              <w:t>(</w:t>
+            </w:r>
+            <w:r>
+              <w:fldChar w:fldCharType="begin"/>
+            </w:r>
+            <w:r>
+              <w:instrText xml:space="preserve"> MERGEFIELD </w:instrText>
+            </w:r>
+            <w:r>
+              <w:instrText>來源</w:instrText>
+            </w:r>
+            <w:r>
+              <w:instrText xml:space="preserve"> </w:instrText>
+            </w:r>
+            <w:r>
+              <w:fldChar w:fldCharType="separate"/>
+            </w:r>
+            <w:r>
+              <w:rPr>
+                <w:noProof/>
+              </w:rPr>
+              <w:t>«</w:t>
+            </w:r>
+            <w:r>
+              <w:rPr>
+                <w:rFonts w:hint="eastAsia"/>
+                <w:noProof/>
+              </w:rPr>
+              <w:t>來源</w:t>
+            </w:r>
+            <w:r>
+              <w:rPr>
+                <w:noProof/>
+              </w:rPr>
+              <w:t>»</w:t>
+            </w:r>
+            <w:r>
+              <w:fldChar w:fldCharType="end"/>
+            </w:r>
+            <w:r>
+              <w:rPr>
+                <w:rFonts w:hint="eastAsia"/>
+              </w:rPr>
+              <w:t>)</w:t>
             </w:r>
           </w:p>
           <w:p>
@@ -2311,6 +2611,7 @@
               <w:ind w:left="190" w:right="190"/>
               <w:jc w:val="center"/>
               <w:rPr>
+                <w:rFonts w:hint="eastAsia"/>
                 <w:b/>
                 <w:bCs/>
               </w:rPr>
@@ -2435,6 +2736,55 @@
             </w:r>
             <w:r>
               <w:fldChar w:fldCharType="end"/>
+            </w:r>
+            <w:r>
+              <w:rPr>
+                <w:rFonts w:hint="eastAsia"/>
+              </w:rPr>
+              <w:t>(</w:t>
+            </w:r>
+            <w:r>
+              <w:fldChar w:fldCharType="begin"/>
+            </w:r>
+            <w:r>
+              <w:instrText xml:space="preserve"> MERGEFIELD </w:instrText>
+            </w:r>
+            <w:r>
+              <w:instrText>來源</w:instrText>
+            </w:r>
+            <w:r>
+              <w:instrText xml:space="preserve"> </w:instrText>
+            </w:r>
+            <w:r>
+              <w:fldChar w:fldCharType="separate"/>
+            </w:r>
+            <w:r>
+              <w:rPr>
+                <w:noProof/>
+              </w:rPr>
+              <w:t>«</w:t>
+            </w:r>
+            <w:r>
+              <w:rPr>
+                <w:rFonts w:hint="eastAsia"/>
+                <w:noProof/>
+              </w:rPr>
+              <w:t>來源</w:t>
+            </w:r>
+            <w:r>
+              <w:rPr>
+                <w:noProof/>
+              </w:rPr>
+              <w:t>»</w:t>
+            </w:r>
+            <w:r>
+              <w:fldChar w:fldCharType="end"/>
+            </w:r>
+            <w:r>
+              <w:rPr>
+                <w:rFonts w:hint="eastAsia"/>
+              </w:rPr>
+              <w:t>)</w:t>
             </w:r>
           </w:p>
           <w:p>
@@ -2686,6 +3036,7 @@
               <w:ind w:left="190" w:right="190"/>
               <w:jc w:val="center"/>
               <w:rPr>
+                <w:rFonts w:hint="eastAsia"/>
                 <w:b/>
                 <w:bCs/>
               </w:rPr>
@@ -2810,6 +3161,55 @@
             </w:r>
             <w:r>
               <w:fldChar w:fldCharType="end"/>
+            </w:r>
+            <w:r>
+              <w:rPr>
+                <w:rFonts w:hint="eastAsia"/>
+              </w:rPr>
+              <w:t>(</w:t>
+            </w:r>
+            <w:r>
+              <w:fldChar w:fldCharType="begin"/>
+            </w:r>
+            <w:r>
+              <w:instrText xml:space="preserve"> MERGEFIELD </w:instrText>
+            </w:r>
+            <w:r>
+              <w:instrText>來源</w:instrText>
+            </w:r>
+            <w:r>
+              <w:instrText xml:space="preserve"> </w:instrText>
+            </w:r>
+            <w:r>
+              <w:fldChar w:fldCharType="separate"/>
+            </w:r>
+            <w:r>
+              <w:rPr>
+                <w:noProof/>
+              </w:rPr>
+              <w:t>«</w:t>
+            </w:r>
+            <w:r>
+              <w:rPr>
+                <w:rFonts w:hint="eastAsia"/>
+                <w:noProof/>
+              </w:rPr>
+              <w:t>來源</w:t>
+            </w:r>
+            <w:r>
+              <w:rPr>
+                <w:noProof/>
+              </w:rPr>
+              <w:t>»</w:t>
+            </w:r>
+            <w:r>
+              <w:fldChar w:fldCharType="end"/>
+            </w:r>
+            <w:r>
+              <w:rPr>
+                <w:rFonts w:hint="eastAsia"/>
+              </w:rPr>
+              <w:t>)</w:t>
             </w:r>
           </w:p>
           <w:p>
@@ -3061,6 +3461,7 @@
               <w:ind w:left="190" w:right="190"/>
               <w:jc w:val="center"/>
               <w:rPr>
+                <w:rFonts w:hint="eastAsia"/>
                 <w:b/>
                 <w:bCs/>
               </w:rPr>
@@ -3185,6 +3586,55 @@
             </w:r>
             <w:r>
               <w:fldChar w:fldCharType="end"/>
+            </w:r>
+            <w:r>
+              <w:rPr>
+                <w:rFonts w:hint="eastAsia"/>
+              </w:rPr>
+              <w:t>(</w:t>
+            </w:r>
+            <w:r>
+              <w:fldChar w:fldCharType="begin"/>
+            </w:r>
+            <w:r>
+              <w:instrText xml:space="preserve"> MERGEFIELD </w:instrText>
+            </w:r>
+            <w:r>
+              <w:instrText>來源</w:instrText>
+            </w:r>
+            <w:r>
+              <w:instrText xml:space="preserve"> </w:instrText>
+            </w:r>
+            <w:r>
+              <w:fldChar w:fldCharType="separate"/>
+            </w:r>
+            <w:r>
+              <w:rPr>
+                <w:noProof/>
+              </w:rPr>
+              <w:t>«</w:t>
+            </w:r>
+            <w:r>
+              <w:rPr>
+                <w:rFonts w:hint="eastAsia"/>
+                <w:noProof/>
+              </w:rPr>
+              <w:t>來源</w:t>
+            </w:r>
+            <w:r>
+              <w:rPr>
+                <w:noProof/>
+              </w:rPr>
+              <w:t>»</w:t>
+            </w:r>
+            <w:r>
+              <w:fldChar w:fldCharType="end"/>
+            </w:r>
+            <w:r>
+              <w:rPr>
+                <w:rFonts w:hint="eastAsia"/>
+              </w:rPr>
+              <w:t>)</w:t>
             </w:r>
           </w:p>
           <w:p>
@@ -3442,6 +3892,7 @@
               <w:ind w:left="190" w:right="190"/>
               <w:jc w:val="center"/>
               <w:rPr>
+                <w:rFonts w:hint="eastAsia"/>
                 <w:b/>
                 <w:bCs/>
               </w:rPr>
@@ -3566,6 +4017,55 @@
             </w:r>
             <w:r>
               <w:fldChar w:fldCharType="end"/>
+            </w:r>
+            <w:r>
+              <w:rPr>
+                <w:rFonts w:hint="eastAsia"/>
+              </w:rPr>
+              <w:t>(</w:t>
+            </w:r>
+            <w:r>
+              <w:fldChar w:fldCharType="begin"/>
+            </w:r>
+            <w:r>
+              <w:instrText xml:space="preserve"> MERGEFIELD </w:instrText>
+            </w:r>
+            <w:r>
+              <w:instrText>來源</w:instrText>
+            </w:r>
+            <w:r>
+              <w:instrText xml:space="preserve"> </w:instrText>
+            </w:r>
+            <w:r>
+              <w:fldChar w:fldCharType="separate"/>
+            </w:r>
+            <w:r>
+              <w:rPr>
+                <w:noProof/>
+              </w:rPr>
+              <w:t>«</w:t>
+            </w:r>
+            <w:r>
+              <w:rPr>
+                <w:rFonts w:hint="eastAsia"/>
+                <w:noProof/>
+              </w:rPr>
+              <w:t>來源</w:t>
+            </w:r>
+            <w:r>
+              <w:rPr>
+                <w:noProof/>
+              </w:rPr>
+              <w:t>»</w:t>
+            </w:r>
+            <w:r>
+              <w:fldChar w:fldCharType="end"/>
+            </w:r>
+            <w:r>
+              <w:rPr>
+                <w:rFonts w:hint="eastAsia"/>
+              </w:rPr>
+              <w:t>)</w:t>
             </w:r>
           </w:p>
           <w:p>
@@ -3817,6 +4317,7 @@
               <w:ind w:left="190" w:right="190"/>
               <w:jc w:val="center"/>
               <w:rPr>
+                <w:rFonts w:hint="eastAsia"/>
                 <w:b/>
                 <w:bCs/>
               </w:rPr>
@@ -3941,6 +4442,55 @@
             </w:r>
             <w:r>
               <w:fldChar w:fldCharType="end"/>
+            </w:r>
+            <w:r>
+              <w:rPr>
+                <w:rFonts w:hint="eastAsia"/>
+              </w:rPr>
+              <w:t>(</w:t>
+            </w:r>
+            <w:r>
+              <w:fldChar w:fldCharType="begin"/>
+            </w:r>
+            <w:r>
+              <w:instrText xml:space="preserve"> MERGEFIELD </w:instrText>
+            </w:r>
+            <w:r>
+              <w:instrText>來源</w:instrText>
+            </w:r>
+            <w:r>
+              <w:instrText xml:space="preserve"> </w:instrText>
+            </w:r>
+            <w:r>
+              <w:fldChar w:fldCharType="separate"/>
+            </w:r>
+            <w:r>
+              <w:rPr>
+                <w:noProof/>
+              </w:rPr>
+              <w:t>«</w:t>
+            </w:r>
+            <w:r>
+              <w:rPr>
+                <w:rFonts w:hint="eastAsia"/>
+                <w:noProof/>
+              </w:rPr>
+              <w:t>來源</w:t>
+            </w:r>
+            <w:r>
+              <w:rPr>
+                <w:noProof/>
+              </w:rPr>
+              <w:t>»</w:t>
+            </w:r>
+            <w:r>
+              <w:fldChar w:fldCharType="end"/>
+            </w:r>
+            <w:r>
+              <w:rPr>
+                <w:rFonts w:hint="eastAsia"/>
+              </w:rPr>
+              <w:t>)</w:t>
             </w:r>
           </w:p>
           <w:p>
@@ -4192,6 +4742,7 @@
               <w:ind w:left="190" w:right="190"/>
               <w:jc w:val="center"/>
               <w:rPr>
+                <w:rFonts w:hint="eastAsia"/>
                 <w:b/>
                 <w:bCs/>
               </w:rPr>
@@ -4316,6 +4867,55 @@
             </w:r>
             <w:r>
               <w:fldChar w:fldCharType="end"/>
+            </w:r>
+            <w:r>
+              <w:rPr>
+                <w:rFonts w:hint="eastAsia"/>
+              </w:rPr>
+              <w:t>(</w:t>
+            </w:r>
+            <w:r>
+              <w:fldChar w:fldCharType="begin"/>
+            </w:r>
+            <w:r>
+              <w:instrText xml:space="preserve"> MERGEFIELD </w:instrText>
+            </w:r>
+            <w:r>
+              <w:instrText>來源</w:instrText>
+            </w:r>
+            <w:r>
+              <w:instrText xml:space="preserve"> </w:instrText>
+            </w:r>
+            <w:r>
+              <w:fldChar w:fldCharType="separate"/>
+            </w:r>
+            <w:r>
+              <w:rPr>
+                <w:noProof/>
+              </w:rPr>
+              <w:t>«</w:t>
+            </w:r>
+            <w:r>
+              <w:rPr>
+                <w:rFonts w:hint="eastAsia"/>
+                <w:noProof/>
+              </w:rPr>
+              <w:t>來源</w:t>
+            </w:r>
+            <w:r>
+              <w:rPr>
+                <w:noProof/>
+              </w:rPr>
+              <w:t>»</w:t>
+            </w:r>
+            <w:r>
+              <w:fldChar w:fldCharType="end"/>
+            </w:r>
+            <w:r>
+              <w:rPr>
+                <w:rFonts w:hint="eastAsia"/>
+              </w:rPr>
+              <w:t>)</w:t>
             </w:r>
           </w:p>
           <w:p>
@@ -4573,6 +5173,7 @@
               <w:ind w:left="190" w:right="190"/>
               <w:jc w:val="center"/>
               <w:rPr>
+                <w:rFonts w:hint="eastAsia"/>
                 <w:b/>
                 <w:bCs/>
               </w:rPr>
@@ -4697,6 +5298,55 @@
             </w:r>
             <w:r>
               <w:fldChar w:fldCharType="end"/>
+            </w:r>
+            <w:r>
+              <w:rPr>
+                <w:rFonts w:hint="eastAsia"/>
+              </w:rPr>
+              <w:t>(</w:t>
+            </w:r>
+            <w:r>
+              <w:fldChar w:fldCharType="begin"/>
+            </w:r>
+            <w:r>
+              <w:instrText xml:space="preserve"> MERGEFIELD </w:instrText>
+            </w:r>
+            <w:r>
+              <w:instrText>來源</w:instrText>
+            </w:r>
+            <w:r>
+              <w:instrText xml:space="preserve"> </w:instrText>
+            </w:r>
+            <w:r>
+              <w:fldChar w:fldCharType="separate"/>
+            </w:r>
+            <w:r>
+              <w:rPr>
+                <w:noProof/>
+              </w:rPr>
+              <w:t>«</w:t>
+            </w:r>
+            <w:r>
+              <w:rPr>
+                <w:rFonts w:hint="eastAsia"/>
+                <w:noProof/>
+              </w:rPr>
+              <w:t>來源</w:t>
+            </w:r>
+            <w:r>
+              <w:rPr>
+                <w:noProof/>
+              </w:rPr>
+              <w:t>»</w:t>
+            </w:r>
+            <w:r>
+              <w:fldChar w:fldCharType="end"/>
+            </w:r>
+            <w:r>
+              <w:rPr>
+                <w:rFonts w:hint="eastAsia"/>
+              </w:rPr>
+              <w:t>)</w:t>
             </w:r>
           </w:p>
           <w:p>
@@ -4948,6 +5598,7 @@
               <w:ind w:left="190" w:right="190"/>
               <w:jc w:val="center"/>
               <w:rPr>
+                <w:rFonts w:hint="eastAsia"/>
                 <w:b/>
                 <w:bCs/>
               </w:rPr>
@@ -5072,6 +5723,55 @@
             </w:r>
             <w:r>
               <w:fldChar w:fldCharType="end"/>
+            </w:r>
+            <w:r>
+              <w:rPr>
+                <w:rFonts w:hint="eastAsia"/>
+              </w:rPr>
+              <w:t>(</w:t>
+            </w:r>
+            <w:r>
+              <w:fldChar w:fldCharType="begin"/>
+            </w:r>
+            <w:r>
+              <w:instrText xml:space="preserve"> MERGEFIELD </w:instrText>
+            </w:r>
+            <w:r>
+              <w:instrText>來源</w:instrText>
+            </w:r>
+            <w:r>
+              <w:instrText xml:space="preserve"> </w:instrText>
+            </w:r>
+            <w:r>
+              <w:fldChar w:fldCharType="separate"/>
+            </w:r>
+            <w:r>
+              <w:rPr>
+                <w:noProof/>
+              </w:rPr>
+              <w:t>«</w:t>
+            </w:r>
+            <w:r>
+              <w:rPr>
+                <w:rFonts w:hint="eastAsia"/>
+                <w:noProof/>
+              </w:rPr>
+              <w:t>來源</w:t>
+            </w:r>
+            <w:r>
+              <w:rPr>
+                <w:noProof/>
+              </w:rPr>
+              <w:t>»</w:t>
+            </w:r>
+            <w:r>
+              <w:fldChar w:fldCharType="end"/>
+            </w:r>
+            <w:r>
+              <w:rPr>
+                <w:rFonts w:hint="eastAsia"/>
+              </w:rPr>
+              <w:t>)</w:t>
             </w:r>
           </w:p>
           <w:p>
@@ -5323,6 +6023,7 @@
               <w:ind w:left="190" w:right="190"/>
               <w:jc w:val="center"/>
               <w:rPr>
+                <w:rFonts w:hint="eastAsia"/>
                 <w:b/>
                 <w:bCs/>
               </w:rPr>
@@ -5447,6 +6148,55 @@
             </w:r>
             <w:r>
               <w:fldChar w:fldCharType="end"/>
+            </w:r>
+            <w:r>
+              <w:rPr>
+                <w:rFonts w:hint="eastAsia"/>
+              </w:rPr>
+              <w:t>(</w:t>
+            </w:r>
+            <w:r>
+              <w:fldChar w:fldCharType="begin"/>
+            </w:r>
+            <w:r>
+              <w:instrText xml:space="preserve"> MERGEFIELD </w:instrText>
+            </w:r>
+            <w:r>
+              <w:instrText>來源</w:instrText>
+            </w:r>
+            <w:r>
+              <w:instrText xml:space="preserve"> </w:instrText>
+            </w:r>
+            <w:r>
+              <w:fldChar w:fldCharType="separate"/>
+            </w:r>
+            <w:r>
+              <w:rPr>
+                <w:noProof/>
+              </w:rPr>
+              <w:t>«</w:t>
+            </w:r>
+            <w:r>
+              <w:rPr>
+                <w:rFonts w:hint="eastAsia"/>
+                <w:noProof/>
+              </w:rPr>
+              <w:t>來源</w:t>
+            </w:r>
+            <w:r>
+              <w:rPr>
+                <w:noProof/>
+              </w:rPr>
+              <w:t>»</w:t>
+            </w:r>
+            <w:r>
+              <w:fldChar w:fldCharType="end"/>
+            </w:r>
+            <w:r>
+              <w:rPr>
+                <w:rFonts w:hint="eastAsia"/>
+              </w:rPr>
+              <w:t>)</w:t>
             </w:r>
           </w:p>
           <w:p>
@@ -5704,6 +6454,7 @@
               <w:ind w:left="190" w:right="190"/>
               <w:jc w:val="center"/>
               <w:rPr>
+                <w:rFonts w:hint="eastAsia"/>
                 <w:b/>
                 <w:bCs/>
               </w:rPr>
@@ -5828,6 +6579,55 @@
             </w:r>
             <w:r>
               <w:fldChar w:fldCharType="end"/>
+            </w:r>
+            <w:r>
+              <w:rPr>
+                <w:rFonts w:hint="eastAsia"/>
+              </w:rPr>
+              <w:t>(</w:t>
+            </w:r>
+            <w:r>
+              <w:fldChar w:fldCharType="begin"/>
+            </w:r>
+            <w:r>
+              <w:instrText xml:space="preserve"> MERGEFIELD </w:instrText>
+            </w:r>
+            <w:r>
+              <w:instrText>來源</w:instrText>
+            </w:r>
+            <w:r>
+              <w:instrText xml:space="preserve"> </w:instrText>
+            </w:r>
+            <w:r>
+              <w:fldChar w:fldCharType="separate"/>
+            </w:r>
+            <w:r>
+              <w:rPr>
+                <w:noProof/>
+              </w:rPr>
+              <w:t>«</w:t>
+            </w:r>
+            <w:r>
+              <w:rPr>
+                <w:rFonts w:hint="eastAsia"/>
+                <w:noProof/>
+              </w:rPr>
+              <w:t>來源</w:t>
+            </w:r>
+            <w:r>
+              <w:rPr>
+                <w:noProof/>
+              </w:rPr>
+              <w:t>»</w:t>
+            </w:r>
+            <w:r>
+              <w:fldChar w:fldCharType="end"/>
+            </w:r>
+            <w:r>
+              <w:rPr>
+                <w:rFonts w:hint="eastAsia"/>
+              </w:rPr>
+              <w:t>)</w:t>
             </w:r>
           </w:p>
           <w:p>
@@ -6079,6 +6879,7 @@
               <w:ind w:left="190" w:right="190"/>
               <w:jc w:val="center"/>
               <w:rPr>
+                <w:rFonts w:hint="eastAsia"/>
                 <w:b/>
                 <w:bCs/>
               </w:rPr>
@@ -6203,6 +7004,55 @@
             </w:r>
             <w:r>
               <w:fldChar w:fldCharType="end"/>
+            </w:r>
+            <w:r>
+              <w:rPr>
+                <w:rFonts w:hint="eastAsia"/>
+              </w:rPr>
+              <w:t>(</w:t>
+            </w:r>
+            <w:r>
+              <w:fldChar w:fldCharType="begin"/>
+            </w:r>
+            <w:r>
+              <w:instrText xml:space="preserve"> MERGEFIELD </w:instrText>
+            </w:r>
+            <w:r>
+              <w:instrText>來源</w:instrText>
+            </w:r>
+            <w:r>
+              <w:instrText xml:space="preserve"> </w:instrText>
+            </w:r>
+            <w:r>
+              <w:fldChar w:fldCharType="separate"/>
+            </w:r>
+            <w:r>
+              <w:rPr>
+                <w:noProof/>
+              </w:rPr>
+              <w:t>«</w:t>
+            </w:r>
+            <w:r>
+              <w:rPr>
+                <w:rFonts w:hint="eastAsia"/>
+                <w:noProof/>
+              </w:rPr>
+              <w:t>來源</w:t>
+            </w:r>
+            <w:r>
+              <w:rPr>
+                <w:noProof/>
+              </w:rPr>
+              <w:t>»</w:t>
+            </w:r>
+            <w:r>
+              <w:fldChar w:fldCharType="end"/>
+            </w:r>
+            <w:r>
+              <w:rPr>
+                <w:rFonts w:hint="eastAsia"/>
+              </w:rPr>
+              <w:t>)</w:t>
             </w:r>
           </w:p>
           <w:p>
@@ -6454,6 +7304,7 @@
               <w:ind w:left="190" w:right="190"/>
               <w:jc w:val="center"/>
               <w:rPr>
+                <w:rFonts w:hint="eastAsia"/>
                 <w:b/>
                 <w:bCs/>
               </w:rPr>
@@ -6578,6 +7429,55 @@
             </w:r>
             <w:r>
               <w:fldChar w:fldCharType="end"/>
+            </w:r>
+            <w:r>
+              <w:rPr>
+                <w:rFonts w:hint="eastAsia"/>
+              </w:rPr>
+              <w:t>(</w:t>
+            </w:r>
+            <w:r>
+              <w:fldChar w:fldCharType="begin"/>
+            </w:r>
+            <w:r>
+              <w:instrText xml:space="preserve"> MERGEFIELD </w:instrText>
+            </w:r>
+            <w:r>
+              <w:instrText>來源</w:instrText>
+            </w:r>
+            <w:r>
+              <w:instrText xml:space="preserve"> </w:instrText>
+            </w:r>
+            <w:r>
+              <w:fldChar w:fldCharType="separate"/>
+            </w:r>
+            <w:r>
+              <w:rPr>
+                <w:noProof/>
+              </w:rPr>
+              <w:t>«</w:t>
+            </w:r>
+            <w:r>
+              <w:rPr>
+                <w:rFonts w:hint="eastAsia"/>
+                <w:noProof/>
+              </w:rPr>
+              <w:t>來源</w:t>
+            </w:r>
+            <w:r>
+              <w:rPr>
+                <w:noProof/>
+              </w:rPr>
+              <w:t>»</w:t>
+            </w:r>
+            <w:r>
+              <w:fldChar w:fldCharType="end"/>
+            </w:r>
+            <w:r>
+              <w:rPr>
+                <w:rFonts w:hint="eastAsia"/>
+              </w:rPr>
+              <w:t>)</w:t>
             </w:r>
           </w:p>
           <w:p>
@@ -6835,6 +7735,7 @@
               <w:ind w:left="190" w:right="190"/>
               <w:jc w:val="center"/>
               <w:rPr>
+                <w:rFonts w:hint="eastAsia"/>
                 <w:b/>
                 <w:bCs/>
               </w:rPr>
@@ -6959,6 +7860,55 @@
             </w:r>
             <w:r>
               <w:fldChar w:fldCharType="end"/>
+            </w:r>
+            <w:r>
+              <w:rPr>
+                <w:rFonts w:hint="eastAsia"/>
+              </w:rPr>
+              <w:t>(</w:t>
+            </w:r>
+            <w:r>
+              <w:fldChar w:fldCharType="begin"/>
+            </w:r>
+            <w:r>
+              <w:instrText xml:space="preserve"> MERGEFIELD </w:instrText>
+            </w:r>
+            <w:r>
+              <w:instrText>來源</w:instrText>
+            </w:r>
+            <w:r>
+              <w:instrText xml:space="preserve"> </w:instrText>
+            </w:r>
+            <w:r>
+              <w:fldChar w:fldCharType="separate"/>
+            </w:r>
+            <w:r>
+              <w:rPr>
+                <w:noProof/>
+              </w:rPr>
+              <w:t>«</w:t>
+            </w:r>
+            <w:r>
+              <w:rPr>
+                <w:rFonts w:hint="eastAsia"/>
+                <w:noProof/>
+              </w:rPr>
+              <w:t>來源</w:t>
+            </w:r>
+            <w:r>
+              <w:rPr>
+                <w:noProof/>
+              </w:rPr>
+              <w:t>»</w:t>
+            </w:r>
+            <w:r>
+              <w:fldChar w:fldCharType="end"/>
+            </w:r>
+            <w:r>
+              <w:rPr>
+                <w:rFonts w:hint="eastAsia"/>
+              </w:rPr>
+              <w:t>)</w:t>
             </w:r>
           </w:p>
           <w:p>
@@ -7210,6 +8160,7 @@
               <w:ind w:left="190" w:right="190"/>
               <w:jc w:val="center"/>
               <w:rPr>
+                <w:rFonts w:hint="eastAsia"/>
                 <w:b/>
                 <w:bCs/>
               </w:rPr>
@@ -7334,6 +8285,55 @@
             </w:r>
             <w:r>
               <w:fldChar w:fldCharType="end"/>
+            </w:r>
+            <w:r>
+              <w:rPr>
+                <w:rFonts w:hint="eastAsia"/>
+              </w:rPr>
+              <w:t>(</w:t>
+            </w:r>
+            <w:r>
+              <w:fldChar w:fldCharType="begin"/>
+            </w:r>
+            <w:r>
+              <w:instrText xml:space="preserve"> MERGEFIELD </w:instrText>
+            </w:r>
+            <w:r>
+              <w:instrText>來源</w:instrText>
+            </w:r>
+            <w:r>
+              <w:instrText xml:space="preserve"> </w:instrText>
+            </w:r>
+            <w:r>
+              <w:fldChar w:fldCharType="separate"/>
+            </w:r>
+            <w:r>
+              <w:rPr>
+                <w:noProof/>
+              </w:rPr>
+              <w:t>«</w:t>
+            </w:r>
+            <w:r>
+              <w:rPr>
+                <w:rFonts w:hint="eastAsia"/>
+                <w:noProof/>
+              </w:rPr>
+              <w:t>來源</w:t>
+            </w:r>
+            <w:r>
+              <w:rPr>
+                <w:noProof/>
+              </w:rPr>
+              <w:t>»</w:t>
+            </w:r>
+            <w:r>
+              <w:fldChar w:fldCharType="end"/>
+            </w:r>
+            <w:r>
+              <w:rPr>
+                <w:rFonts w:hint="eastAsia"/>
+              </w:rPr>
+              <w:t>)</w:t>
             </w:r>
           </w:p>
           <w:p>
@@ -7585,6 +8585,7 @@
               <w:ind w:left="190" w:right="190"/>
               <w:jc w:val="center"/>
               <w:rPr>
+                <w:rFonts w:hint="eastAsia"/>
                 <w:b/>
                 <w:bCs/>
               </w:rPr>
@@ -7709,6 +8710,55 @@
             </w:r>
             <w:r>
               <w:fldChar w:fldCharType="end"/>
+            </w:r>
+            <w:r>
+              <w:rPr>
+                <w:rFonts w:hint="eastAsia"/>
+              </w:rPr>
+              <w:t>(</w:t>
+            </w:r>
+            <w:r>
+              <w:fldChar w:fldCharType="begin"/>
+            </w:r>
+            <w:r>
+              <w:instrText xml:space="preserve"> MERGEFIELD </w:instrText>
+            </w:r>
+            <w:r>
+              <w:instrText>來源</w:instrText>
+            </w:r>
+            <w:r>
+              <w:instrText xml:space="preserve"> </w:instrText>
+            </w:r>
+            <w:r>
+              <w:fldChar w:fldCharType="separate"/>
+            </w:r>
+            <w:r>
+              <w:rPr>
+                <w:noProof/>
+              </w:rPr>
+              <w:t>«</w:t>
+            </w:r>
+            <w:r>
+              <w:rPr>
+                <w:rFonts w:hint="eastAsia"/>
+                <w:noProof/>
+              </w:rPr>
+              <w:t>來源</w:t>
+            </w:r>
+            <w:r>
+              <w:rPr>
+                <w:noProof/>
+              </w:rPr>
+              <w:t>»</w:t>
+            </w:r>
+            <w:r>
+              <w:fldChar w:fldCharType="end"/>
+            </w:r>
+            <w:r>
+              <w:rPr>
+                <w:rFonts w:hint="eastAsia"/>
+              </w:rPr>
+              <w:t>)</w:t>
             </w:r>
           </w:p>
           <w:p>

</xml_diff>